<commit_message>
Stage 5 title page (4 authors) and cover letter; Stage 6 process record EN+VI (MD + XeLaTeX PDF) with collaboration-depth chapter
Co-Authored-By: Claude Opus 5.5 <noreply@anthropic.com>
Claude-Session: https://claude.ai/code/session_01H9iHZGmP6JhCq5jxPGTAWf
</commit_message>
<xml_diff>
--- a/ars/stage5_finalize/work/cover_letter.docx
+++ b/ars/stage5_finalize/work/cover_letter.docx
@@ -7,7 +7,7 @@
         <w:pStyle w:val="FirstParagraph"/>
       </w:pPr>
       <w:r>
-        <w:t xml:space="preserve">[Date]</w:t>
+        <w:t xml:space="preserve">24 September 2026</w:t>
       </w:r>
     </w:p>
     <w:p>
@@ -125,19 +125,19 @@
         <w:pStyle w:val="BodyText"/>
       </w:pPr>
       <w:r>
-        <w:t xml:space="preserve">[Corresponding author name]</w:t>
+        <w:t xml:space="preserve">Nguyen Van Trung (corresponding author), on behalf of all authors</w:t>
       </w:r>
       <w:r>
         <w:t xml:space="preserve"> </w:t>
       </w:r>
       <w:r>
-        <w:t xml:space="preserve">[Affiliation]</w:t>
+        <w:t xml:space="preserve">Academy of Policy and Development, Nam An Khanh Urban Area, Hoai Duc District, Hanoi, Vietnam</w:t>
       </w:r>
       <w:r>
         <w:t xml:space="preserve"> </w:t>
       </w:r>
       <w:r>
-        <w:t xml:space="preserve">[Email]</w:t>
+        <w:t xml:space="preserve">Email: 15233582@st.neu.edu.vn; Tel: +84 355 347 831</w:t>
       </w:r>
     </w:p>
     <w:sectPr>

</xml_diff>